<commit_message>
Added BPMN and collaboration diagram
</commit_message>
<xml_diff>
--- a/Sequence Diagrams/JD_sequence diagrams .docx
+++ b/Sequence Diagrams/JD_sequence diagrams .docx
@@ -113,10 +113,10 @@
           <w:szCs w:val="28"/>
         </w:rPr>
         <w:drawing>
-          <wp:inline distT="0" distB="0" distL="0" distR="0" wp14:anchorId="02D540FB" wp14:editId="2DD567B5">
-            <wp:extent cx="5943600" cy="5555615"/>
-            <wp:effectExtent l="0" t="0" r="0" b="6985"/>
-            <wp:docPr id="1" name="Picture 1" descr="A screenshot of a library management system&#10;&#10;Description automatically generated"/>
+          <wp:inline distT="0" distB="0" distL="0" distR="0" wp14:anchorId="3DF6A39C" wp14:editId="5D06F2E2">
+            <wp:extent cx="5413972" cy="5577043"/>
+            <wp:effectExtent l="0" t="0" r="0" b="5080"/>
+            <wp:docPr id="3" name="Picture 3"/>
             <wp:cNvGraphicFramePr>
               <a:graphicFrameLocks xmlns:a="http://schemas.openxmlformats.org/drawingml/2006/main" noChangeAspect="1"/>
             </wp:cNvGraphicFramePr>
@@ -124,7 +124,7 @@
               <a:graphicData uri="http://schemas.openxmlformats.org/drawingml/2006/picture">
                 <pic:pic xmlns:pic="http://schemas.openxmlformats.org/drawingml/2006/picture">
                   <pic:nvPicPr>
-                    <pic:cNvPr id="1" name="Picture 1" descr="A screenshot of a library management system&#10;&#10;Description automatically generated"/>
+                    <pic:cNvPr id="3" name="Picture 3"/>
                     <pic:cNvPicPr/>
                   </pic:nvPicPr>
                   <pic:blipFill>
@@ -142,7 +142,7 @@
                   <pic:spPr>
                     <a:xfrm>
                       <a:off x="0" y="0"/>
-                      <a:ext cx="5943600" cy="5555615"/>
+                      <a:ext cx="5421055" cy="5584339"/>
                     </a:xfrm>
                     <a:prstGeom prst="rect">
                       <a:avLst/>
@@ -214,14 +214,23 @@
           <w:szCs w:val="28"/>
         </w:rPr>
       </w:pPr>
-      <w:r>
-        <w:rPr>
-          <w:b/>
-          <w:bCs/>
-          <w:sz w:val="28"/>
-          <w:szCs w:val="28"/>
-        </w:rPr>
-        <w:lastRenderedPageBreak/>
+    </w:p>
+    <w:p>
+      <w:pPr>
+        <w:rPr>
+          <w:b/>
+          <w:bCs/>
+          <w:sz w:val="28"/>
+          <w:szCs w:val="28"/>
+        </w:rPr>
+      </w:pPr>
+      <w:r>
+        <w:rPr>
+          <w:b/>
+          <w:bCs/>
+          <w:sz w:val="28"/>
+          <w:szCs w:val="28"/>
+        </w:rPr>
         <w:t>SC</w:t>
       </w:r>
       <w:r>
@@ -281,10 +290,10 @@
           <w:szCs w:val="28"/>
         </w:rPr>
         <w:drawing>
-          <wp:inline distT="0" distB="0" distL="0" distR="0" wp14:anchorId="2E8BD1AE" wp14:editId="5F44DB6B">
-            <wp:extent cx="5943600" cy="5376545"/>
+          <wp:inline distT="0" distB="0" distL="0" distR="0" wp14:anchorId="66E9B91E" wp14:editId="6DDDA4B6">
+            <wp:extent cx="5703683" cy="4882779"/>
             <wp:effectExtent l="0" t="0" r="0" b="0"/>
-            <wp:docPr id="2" name="Picture 2" descr="A computer screen shot of a program&#10;&#10;Description automatically generated"/>
+            <wp:docPr id="8" name="Picture 8" descr="A screenshot of a computer program&#10;&#10;Description automatically generated"/>
             <wp:cNvGraphicFramePr>
               <a:graphicFrameLocks xmlns:a="http://schemas.openxmlformats.org/drawingml/2006/main" noChangeAspect="1"/>
             </wp:cNvGraphicFramePr>
@@ -292,7 +301,7 @@
               <a:graphicData uri="http://schemas.openxmlformats.org/drawingml/2006/picture">
                 <pic:pic xmlns:pic="http://schemas.openxmlformats.org/drawingml/2006/picture">
                   <pic:nvPicPr>
-                    <pic:cNvPr id="2" name="Picture 2" descr="A computer screen shot of a program&#10;&#10;Description automatically generated"/>
+                    <pic:cNvPr id="8" name="Picture 8" descr="A screenshot of a computer program&#10;&#10;Description automatically generated"/>
                     <pic:cNvPicPr/>
                   </pic:nvPicPr>
                   <pic:blipFill>
@@ -310,7 +319,7 @@
                   <pic:spPr>
                     <a:xfrm>
                       <a:off x="0" y="0"/>
-                      <a:ext cx="5943600" cy="5376545"/>
+                      <a:ext cx="5711950" cy="4889856"/>
                     </a:xfrm>
                     <a:prstGeom prst="rect">
                       <a:avLst/>
@@ -458,10 +467,10 @@
           <w:szCs w:val="28"/>
         </w:rPr>
         <w:drawing>
-          <wp:inline distT="0" distB="0" distL="0" distR="0" wp14:anchorId="5D4DF282" wp14:editId="4166EF79">
-            <wp:extent cx="5943600" cy="5595620"/>
-            <wp:effectExtent l="0" t="0" r="0" b="5080"/>
-            <wp:docPr id="4" name="Picture 4" descr="A diagram of a program&#10;&#10;Description automatically generated"/>
+          <wp:inline distT="0" distB="0" distL="0" distR="0" wp14:anchorId="1BB8B237" wp14:editId="11EEE7F0">
+            <wp:extent cx="5889092" cy="5144494"/>
+            <wp:effectExtent l="0" t="0" r="0" b="0"/>
+            <wp:docPr id="9" name="Picture 9" descr="A diagram of a program&#10;&#10;Description automatically generated"/>
             <wp:cNvGraphicFramePr>
               <a:graphicFrameLocks xmlns:a="http://schemas.openxmlformats.org/drawingml/2006/main" noChangeAspect="1"/>
             </wp:cNvGraphicFramePr>
@@ -469,7 +478,7 @@
               <a:graphicData uri="http://schemas.openxmlformats.org/drawingml/2006/picture">
                 <pic:pic xmlns:pic="http://schemas.openxmlformats.org/drawingml/2006/picture">
                   <pic:nvPicPr>
-                    <pic:cNvPr id="4" name="Picture 4" descr="A diagram of a program&#10;&#10;Description automatically generated"/>
+                    <pic:cNvPr id="9" name="Picture 9" descr="A diagram of a program&#10;&#10;Description automatically generated"/>
                     <pic:cNvPicPr/>
                   </pic:nvPicPr>
                   <pic:blipFill>
@@ -487,7 +496,7 @@
                   <pic:spPr>
                     <a:xfrm>
                       <a:off x="0" y="0"/>
-                      <a:ext cx="5943600" cy="5595620"/>
+                      <a:ext cx="5896110" cy="5150624"/>
                     </a:xfrm>
                     <a:prstGeom prst="rect">
                       <a:avLst/>
@@ -569,6 +578,16 @@
           <w:szCs w:val="28"/>
         </w:rPr>
       </w:pPr>
+    </w:p>
+    <w:p>
+      <w:pPr>
+        <w:rPr>
+          <w:b/>
+          <w:bCs/>
+          <w:sz w:val="28"/>
+          <w:szCs w:val="28"/>
+        </w:rPr>
+      </w:pPr>
       <w:r>
         <w:rPr>
           <w:b/>
@@ -625,10 +644,10 @@
           <w:szCs w:val="28"/>
         </w:rPr>
         <w:drawing>
-          <wp:inline distT="0" distB="0" distL="0" distR="0" wp14:anchorId="73CCB09C" wp14:editId="744F02B6">
-            <wp:extent cx="5943600" cy="5702300"/>
+          <wp:inline distT="0" distB="0" distL="0" distR="0" wp14:anchorId="3D709AB2" wp14:editId="5AE7F3E7">
+            <wp:extent cx="5700799" cy="5152446"/>
             <wp:effectExtent l="0" t="0" r="0" b="0"/>
-            <wp:docPr id="5" name="Picture 5" descr="A diagram of a library management system&#10;&#10;Description automatically generated"/>
+            <wp:docPr id="10" name="Picture 10" descr="A diagram of a program&#10;&#10;Description automatically generated"/>
             <wp:cNvGraphicFramePr>
               <a:graphicFrameLocks xmlns:a="http://schemas.openxmlformats.org/drawingml/2006/main" noChangeAspect="1"/>
             </wp:cNvGraphicFramePr>
@@ -636,7 +655,7 @@
               <a:graphicData uri="http://schemas.openxmlformats.org/drawingml/2006/picture">
                 <pic:pic xmlns:pic="http://schemas.openxmlformats.org/drawingml/2006/picture">
                   <pic:nvPicPr>
-                    <pic:cNvPr id="5" name="Picture 5" descr="A diagram of a library management system&#10;&#10;Description automatically generated"/>
+                    <pic:cNvPr id="10" name="Picture 10" descr="A diagram of a program&#10;&#10;Description automatically generated"/>
                     <pic:cNvPicPr/>
                   </pic:nvPicPr>
                   <pic:blipFill>
@@ -654,7 +673,7 @@
                   <pic:spPr>
                     <a:xfrm>
                       <a:off x="0" y="0"/>
-                      <a:ext cx="5943600" cy="5702300"/>
+                      <a:ext cx="5708843" cy="5159716"/>
                     </a:xfrm>
                     <a:prstGeom prst="rect">
                       <a:avLst/>
@@ -736,6 +755,16 @@
           <w:szCs w:val="28"/>
         </w:rPr>
       </w:pPr>
+    </w:p>
+    <w:p>
+      <w:pPr>
+        <w:rPr>
+          <w:b/>
+          <w:bCs/>
+          <w:sz w:val="28"/>
+          <w:szCs w:val="28"/>
+        </w:rPr>
+      </w:pPr>
       <w:r>
         <w:rPr>
           <w:b/>
@@ -802,10 +831,10 @@
           <w:szCs w:val="28"/>
         </w:rPr>
         <w:drawing>
-          <wp:inline distT="0" distB="0" distL="0" distR="0" wp14:anchorId="0F183FB0" wp14:editId="69124C5D">
-            <wp:extent cx="5943600" cy="5831840"/>
+          <wp:inline distT="0" distB="0" distL="0" distR="0" wp14:anchorId="67474670" wp14:editId="0B83FD20">
+            <wp:extent cx="5943600" cy="4653915"/>
             <wp:effectExtent l="0" t="0" r="0" b="0"/>
-            <wp:docPr id="6" name="Picture 6" descr="A screenshot of a library management system&#10;&#10;Description automatically generated"/>
+            <wp:docPr id="11" name="Picture 11" descr="A screenshot of a diagram&#10;&#10;Description automatically generated"/>
             <wp:cNvGraphicFramePr>
               <a:graphicFrameLocks xmlns:a="http://schemas.openxmlformats.org/drawingml/2006/main" noChangeAspect="1"/>
             </wp:cNvGraphicFramePr>
@@ -813,7 +842,7 @@
               <a:graphicData uri="http://schemas.openxmlformats.org/drawingml/2006/picture">
                 <pic:pic xmlns:pic="http://schemas.openxmlformats.org/drawingml/2006/picture">
                   <pic:nvPicPr>
-                    <pic:cNvPr id="6" name="Picture 6" descr="A screenshot of a library management system&#10;&#10;Description automatically generated"/>
+                    <pic:cNvPr id="11" name="Picture 11" descr="A screenshot of a diagram&#10;&#10;Description automatically generated"/>
                     <pic:cNvPicPr/>
                   </pic:nvPicPr>
                   <pic:blipFill>
@@ -831,7 +860,7 @@
                   <pic:spPr>
                     <a:xfrm>
                       <a:off x="0" y="0"/>
-                      <a:ext cx="5943600" cy="5831840"/>
+                      <a:ext cx="5943600" cy="4653915"/>
                     </a:xfrm>
                     <a:prstGeom prst="rect">
                       <a:avLst/>
@@ -903,6 +932,46 @@
           <w:szCs w:val="28"/>
         </w:rPr>
       </w:pPr>
+    </w:p>
+    <w:p>
+      <w:pPr>
+        <w:rPr>
+          <w:b/>
+          <w:bCs/>
+          <w:sz w:val="28"/>
+          <w:szCs w:val="28"/>
+        </w:rPr>
+      </w:pPr>
+    </w:p>
+    <w:p>
+      <w:pPr>
+        <w:rPr>
+          <w:b/>
+          <w:bCs/>
+          <w:sz w:val="28"/>
+          <w:szCs w:val="28"/>
+        </w:rPr>
+      </w:pPr>
+    </w:p>
+    <w:p>
+      <w:pPr>
+        <w:rPr>
+          <w:b/>
+          <w:bCs/>
+          <w:sz w:val="28"/>
+          <w:szCs w:val="28"/>
+        </w:rPr>
+      </w:pPr>
+    </w:p>
+    <w:p>
+      <w:pPr>
+        <w:rPr>
+          <w:b/>
+          <w:bCs/>
+          <w:sz w:val="28"/>
+          <w:szCs w:val="28"/>
+        </w:rPr>
+      </w:pPr>
       <w:r>
         <w:rPr>
           <w:b/>
@@ -911,7 +980,16 @@
           <w:szCs w:val="28"/>
         </w:rPr>
         <w:lastRenderedPageBreak/>
-        <w:t>AC_LMS_32</w:t>
+        <w:t>SC</w:t>
+      </w:r>
+      <w:r>
+        <w:rPr>
+          <w:b/>
+          <w:bCs/>
+          <w:sz w:val="28"/>
+          <w:szCs w:val="28"/>
+        </w:rPr>
+        <w:t>_32</w:t>
       </w:r>
       <w:r>
         <w:rPr>
@@ -950,10 +1028,10 @@
           <w:szCs w:val="28"/>
         </w:rPr>
         <w:drawing>
-          <wp:inline distT="0" distB="0" distL="0" distR="0" wp14:anchorId="10A792E4" wp14:editId="35B7F298">
-            <wp:extent cx="5943600" cy="5831840"/>
+          <wp:inline distT="0" distB="0" distL="0" distR="0" wp14:anchorId="2CC62BCC" wp14:editId="715B33D3">
+            <wp:extent cx="5836257" cy="5454121"/>
             <wp:effectExtent l="0" t="0" r="0" b="0"/>
-            <wp:docPr id="7" name="Picture 7" descr="A screenshot of a library management system&#10;&#10;Description automatically generated"/>
+            <wp:docPr id="12" name="Picture 12" descr="A screenshot of a computer program&#10;&#10;Description automatically generated"/>
             <wp:cNvGraphicFramePr>
               <a:graphicFrameLocks xmlns:a="http://schemas.openxmlformats.org/drawingml/2006/main" noChangeAspect="1"/>
             </wp:cNvGraphicFramePr>
@@ -961,7 +1039,7 @@
               <a:graphicData uri="http://schemas.openxmlformats.org/drawingml/2006/picture">
                 <pic:pic xmlns:pic="http://schemas.openxmlformats.org/drawingml/2006/picture">
                   <pic:nvPicPr>
-                    <pic:cNvPr id="7" name="Picture 7" descr="A screenshot of a library management system&#10;&#10;Description automatically generated"/>
+                    <pic:cNvPr id="12" name="Picture 12" descr="A screenshot of a computer program&#10;&#10;Description automatically generated"/>
                     <pic:cNvPicPr/>
                   </pic:nvPicPr>
                   <pic:blipFill>
@@ -979,7 +1057,7 @@
                   <pic:spPr>
                     <a:xfrm>
                       <a:off x="0" y="0"/>
-                      <a:ext cx="5943600" cy="5831840"/>
+                      <a:ext cx="5842674" cy="5460118"/>
                     </a:xfrm>
                     <a:prstGeom prst="rect">
                       <a:avLst/>

</xml_diff>

<commit_message>
Added Interaction overview diagrams
</commit_message>
<xml_diff>
--- a/Sequence Diagrams/JD_sequence diagrams .docx
+++ b/Sequence Diagrams/JD_sequence diagrams .docx
@@ -113,10 +113,10 @@
           <w:szCs w:val="28"/>
         </w:rPr>
         <w:drawing>
-          <wp:inline distT="0" distB="0" distL="0" distR="0" wp14:anchorId="3DF6A39C" wp14:editId="5D06F2E2">
-            <wp:extent cx="5413972" cy="5577043"/>
-            <wp:effectExtent l="0" t="0" r="0" b="5080"/>
-            <wp:docPr id="3" name="Picture 3"/>
+          <wp:inline distT="0" distB="0" distL="0" distR="0" wp14:anchorId="0EA06ADD" wp14:editId="382277A8">
+            <wp:extent cx="5943600" cy="4059555"/>
+            <wp:effectExtent l="0" t="0" r="0" b="0"/>
+            <wp:docPr id="1" name="Picture 1"/>
             <wp:cNvGraphicFramePr>
               <a:graphicFrameLocks xmlns:a="http://schemas.openxmlformats.org/drawingml/2006/main" noChangeAspect="1"/>
             </wp:cNvGraphicFramePr>
@@ -124,7 +124,7 @@
               <a:graphicData uri="http://schemas.openxmlformats.org/drawingml/2006/picture">
                 <pic:pic xmlns:pic="http://schemas.openxmlformats.org/drawingml/2006/picture">
                   <pic:nvPicPr>
-                    <pic:cNvPr id="3" name="Picture 3"/>
+                    <pic:cNvPr id="1" name="Picture 1"/>
                     <pic:cNvPicPr/>
                   </pic:nvPicPr>
                   <pic:blipFill>
@@ -142,7 +142,7 @@
                   <pic:spPr>
                     <a:xfrm>
                       <a:off x="0" y="0"/>
-                      <a:ext cx="5421055" cy="5584339"/>
+                      <a:ext cx="5943600" cy="4059555"/>
                     </a:xfrm>
                     <a:prstGeom prst="rect">
                       <a:avLst/>
@@ -224,13 +224,44 @@
           <w:szCs w:val="28"/>
         </w:rPr>
       </w:pPr>
-      <w:r>
-        <w:rPr>
-          <w:b/>
-          <w:bCs/>
-          <w:sz w:val="28"/>
-          <w:szCs w:val="28"/>
-        </w:rPr>
+    </w:p>
+    <w:p>
+      <w:pPr>
+        <w:rPr>
+          <w:b/>
+          <w:bCs/>
+          <w:sz w:val="28"/>
+          <w:szCs w:val="28"/>
+        </w:rPr>
+      </w:pPr>
+    </w:p>
+    <w:p>
+      <w:pPr>
+        <w:rPr>
+          <w:b/>
+          <w:bCs/>
+          <w:sz w:val="28"/>
+          <w:szCs w:val="28"/>
+        </w:rPr>
+      </w:pPr>
+    </w:p>
+    <w:p>
+      <w:pPr>
+        <w:rPr>
+          <w:b/>
+          <w:bCs/>
+          <w:sz w:val="28"/>
+          <w:szCs w:val="28"/>
+        </w:rPr>
+      </w:pPr>
+      <w:r>
+        <w:rPr>
+          <w:b/>
+          <w:bCs/>
+          <w:sz w:val="28"/>
+          <w:szCs w:val="28"/>
+        </w:rPr>
+        <w:lastRenderedPageBreak/>
         <w:t>SC</w:t>
       </w:r>
       <w:r>
@@ -290,10 +321,10 @@
           <w:szCs w:val="28"/>
         </w:rPr>
         <w:drawing>
-          <wp:inline distT="0" distB="0" distL="0" distR="0" wp14:anchorId="66E9B91E" wp14:editId="6DDDA4B6">
-            <wp:extent cx="5703683" cy="4882779"/>
-            <wp:effectExtent l="0" t="0" r="0" b="0"/>
-            <wp:docPr id="8" name="Picture 8" descr="A screenshot of a computer program&#10;&#10;Description automatically generated"/>
+          <wp:inline distT="0" distB="0" distL="0" distR="0" wp14:anchorId="082EB877" wp14:editId="23709C35">
+            <wp:extent cx="5943600" cy="3999865"/>
+            <wp:effectExtent l="0" t="0" r="0" b="635"/>
+            <wp:docPr id="2" name="Picture 2" descr="A screenshot of a computer screen&#10;&#10;Description automatically generated"/>
             <wp:cNvGraphicFramePr>
               <a:graphicFrameLocks xmlns:a="http://schemas.openxmlformats.org/drawingml/2006/main" noChangeAspect="1"/>
             </wp:cNvGraphicFramePr>
@@ -301,7 +332,7 @@
               <a:graphicData uri="http://schemas.openxmlformats.org/drawingml/2006/picture">
                 <pic:pic xmlns:pic="http://schemas.openxmlformats.org/drawingml/2006/picture">
                   <pic:nvPicPr>
-                    <pic:cNvPr id="8" name="Picture 8" descr="A screenshot of a computer program&#10;&#10;Description automatically generated"/>
+                    <pic:cNvPr id="2" name="Picture 2" descr="A screenshot of a computer screen&#10;&#10;Description automatically generated"/>
                     <pic:cNvPicPr/>
                   </pic:nvPicPr>
                   <pic:blipFill>
@@ -319,7 +350,7 @@
                   <pic:spPr>
                     <a:xfrm>
                       <a:off x="0" y="0"/>
-                      <a:ext cx="5711950" cy="4889856"/>
+                      <a:ext cx="5943600" cy="3999865"/>
                     </a:xfrm>
                     <a:prstGeom prst="rect">
                       <a:avLst/>
@@ -411,6 +442,36 @@
           <w:szCs w:val="28"/>
         </w:rPr>
       </w:pPr>
+    </w:p>
+    <w:p>
+      <w:pPr>
+        <w:rPr>
+          <w:b/>
+          <w:bCs/>
+          <w:sz w:val="28"/>
+          <w:szCs w:val="28"/>
+        </w:rPr>
+      </w:pPr>
+    </w:p>
+    <w:p>
+      <w:pPr>
+        <w:rPr>
+          <w:b/>
+          <w:bCs/>
+          <w:sz w:val="28"/>
+          <w:szCs w:val="28"/>
+        </w:rPr>
+      </w:pPr>
+    </w:p>
+    <w:p>
+      <w:pPr>
+        <w:rPr>
+          <w:b/>
+          <w:bCs/>
+          <w:sz w:val="28"/>
+          <w:szCs w:val="28"/>
+        </w:rPr>
+      </w:pPr>
       <w:r>
         <w:rPr>
           <w:b/>
@@ -467,10 +528,10 @@
           <w:szCs w:val="28"/>
         </w:rPr>
         <w:drawing>
-          <wp:inline distT="0" distB="0" distL="0" distR="0" wp14:anchorId="1BB8B237" wp14:editId="11EEE7F0">
-            <wp:extent cx="5889092" cy="5144494"/>
-            <wp:effectExtent l="0" t="0" r="0" b="0"/>
-            <wp:docPr id="9" name="Picture 9" descr="A diagram of a program&#10;&#10;Description automatically generated"/>
+          <wp:inline distT="0" distB="0" distL="0" distR="0" wp14:anchorId="57A97EED" wp14:editId="2BE424BF">
+            <wp:extent cx="5732780" cy="5240020"/>
+            <wp:effectExtent l="0" t="0" r="1270" b="0"/>
+            <wp:docPr id="4" name="Picture 4"/>
             <wp:cNvGraphicFramePr>
               <a:graphicFrameLocks xmlns:a="http://schemas.openxmlformats.org/drawingml/2006/main" noChangeAspect="1"/>
             </wp:cNvGraphicFramePr>
@@ -478,8 +539,10 @@
               <a:graphicData uri="http://schemas.openxmlformats.org/drawingml/2006/picture">
                 <pic:pic xmlns:pic="http://schemas.openxmlformats.org/drawingml/2006/picture">
                   <pic:nvPicPr>
-                    <pic:cNvPr id="9" name="Picture 9" descr="A diagram of a program&#10;&#10;Description automatically generated"/>
-                    <pic:cNvPicPr/>
+                    <pic:cNvPr id="0" name="Picture 1"/>
+                    <pic:cNvPicPr>
+                      <a:picLocks noChangeAspect="1" noChangeArrowheads="1"/>
+                    </pic:cNvPicPr>
                   </pic:nvPicPr>
                   <pic:blipFill>
                     <a:blip r:embed="rId6">
@@ -489,18 +552,23 @@
                         </a:ext>
                       </a:extLst>
                     </a:blip>
+                    <a:srcRect/>
                     <a:stretch>
                       <a:fillRect/>
                     </a:stretch>
                   </pic:blipFill>
-                  <pic:spPr>
+                  <pic:spPr bwMode="auto">
                     <a:xfrm>
                       <a:off x="0" y="0"/>
-                      <a:ext cx="5896110" cy="5150624"/>
+                      <a:ext cx="5732780" cy="5240020"/>
                     </a:xfrm>
                     <a:prstGeom prst="rect">
                       <a:avLst/>
                     </a:prstGeom>
+                    <a:noFill/>
+                    <a:ln>
+                      <a:noFill/>
+                    </a:ln>
                   </pic:spPr>
                 </pic:pic>
               </a:graphicData>
@@ -644,10 +712,10 @@
           <w:szCs w:val="28"/>
         </w:rPr>
         <w:drawing>
-          <wp:inline distT="0" distB="0" distL="0" distR="0" wp14:anchorId="3D709AB2" wp14:editId="5AE7F3E7">
-            <wp:extent cx="5700799" cy="5152446"/>
-            <wp:effectExtent l="0" t="0" r="0" b="0"/>
-            <wp:docPr id="10" name="Picture 10" descr="A diagram of a program&#10;&#10;Description automatically generated"/>
+          <wp:inline distT="0" distB="0" distL="0" distR="0" wp14:anchorId="10AFC41C" wp14:editId="5F2192B3">
+            <wp:extent cx="5478145" cy="5240020"/>
+            <wp:effectExtent l="0" t="0" r="8255" b="0"/>
+            <wp:docPr id="5" name="Picture 5"/>
             <wp:cNvGraphicFramePr>
               <a:graphicFrameLocks xmlns:a="http://schemas.openxmlformats.org/drawingml/2006/main" noChangeAspect="1"/>
             </wp:cNvGraphicFramePr>
@@ -655,8 +723,10 @@
               <a:graphicData uri="http://schemas.openxmlformats.org/drawingml/2006/picture">
                 <pic:pic xmlns:pic="http://schemas.openxmlformats.org/drawingml/2006/picture">
                   <pic:nvPicPr>
-                    <pic:cNvPr id="10" name="Picture 10" descr="A diagram of a program&#10;&#10;Description automatically generated"/>
-                    <pic:cNvPicPr/>
+                    <pic:cNvPr id="0" name="Picture 2"/>
+                    <pic:cNvPicPr>
+                      <a:picLocks noChangeAspect="1" noChangeArrowheads="1"/>
+                    </pic:cNvPicPr>
                   </pic:nvPicPr>
                   <pic:blipFill>
                     <a:blip r:embed="rId7">
@@ -666,18 +736,23 @@
                         </a:ext>
                       </a:extLst>
                     </a:blip>
+                    <a:srcRect/>
                     <a:stretch>
                       <a:fillRect/>
                     </a:stretch>
                   </pic:blipFill>
-                  <pic:spPr>
+                  <pic:spPr bwMode="auto">
                     <a:xfrm>
                       <a:off x="0" y="0"/>
-                      <a:ext cx="5708843" cy="5159716"/>
+                      <a:ext cx="5478145" cy="5240020"/>
                     </a:xfrm>
                     <a:prstGeom prst="rect">
                       <a:avLst/>
                     </a:prstGeom>
+                    <a:noFill/>
+                    <a:ln>
+                      <a:noFill/>
+                    </a:ln>
                   </pic:spPr>
                 </pic:pic>
               </a:graphicData>
@@ -831,10 +906,10 @@
           <w:szCs w:val="28"/>
         </w:rPr>
         <w:drawing>
-          <wp:inline distT="0" distB="0" distL="0" distR="0" wp14:anchorId="67474670" wp14:editId="0B83FD20">
-            <wp:extent cx="5943600" cy="4653915"/>
-            <wp:effectExtent l="0" t="0" r="0" b="0"/>
-            <wp:docPr id="11" name="Picture 11" descr="A screenshot of a diagram&#10;&#10;Description automatically generated"/>
+          <wp:inline distT="0" distB="0" distL="0" distR="0" wp14:anchorId="48F24529" wp14:editId="0043EFFB">
+            <wp:extent cx="5939790" cy="3856355"/>
+            <wp:effectExtent l="0" t="0" r="3810" b="0"/>
+            <wp:docPr id="6" name="Picture 6"/>
             <wp:cNvGraphicFramePr>
               <a:graphicFrameLocks xmlns:a="http://schemas.openxmlformats.org/drawingml/2006/main" noChangeAspect="1"/>
             </wp:cNvGraphicFramePr>
@@ -842,8 +917,10 @@
               <a:graphicData uri="http://schemas.openxmlformats.org/drawingml/2006/picture">
                 <pic:pic xmlns:pic="http://schemas.openxmlformats.org/drawingml/2006/picture">
                   <pic:nvPicPr>
-                    <pic:cNvPr id="11" name="Picture 11" descr="A screenshot of a diagram&#10;&#10;Description automatically generated"/>
-                    <pic:cNvPicPr/>
+                    <pic:cNvPr id="0" name="Picture 3"/>
+                    <pic:cNvPicPr>
+                      <a:picLocks noChangeAspect="1" noChangeArrowheads="1"/>
+                    </pic:cNvPicPr>
                   </pic:nvPicPr>
                   <pic:blipFill>
                     <a:blip r:embed="rId8">
@@ -853,18 +930,23 @@
                         </a:ext>
                       </a:extLst>
                     </a:blip>
+                    <a:srcRect/>
                     <a:stretch>
                       <a:fillRect/>
                     </a:stretch>
                   </pic:blipFill>
-                  <pic:spPr>
+                  <pic:spPr bwMode="auto">
                     <a:xfrm>
                       <a:off x="0" y="0"/>
-                      <a:ext cx="5943600" cy="4653915"/>
+                      <a:ext cx="5939790" cy="3856355"/>
                     </a:xfrm>
                     <a:prstGeom prst="rect">
                       <a:avLst/>
                     </a:prstGeom>
+                    <a:noFill/>
+                    <a:ln>
+                      <a:noFill/>
+                    </a:ln>
                   </pic:spPr>
                 </pic:pic>
               </a:graphicData>
@@ -972,6 +1054,26 @@
           <w:szCs w:val="28"/>
         </w:rPr>
       </w:pPr>
+    </w:p>
+    <w:p>
+      <w:pPr>
+        <w:rPr>
+          <w:b/>
+          <w:bCs/>
+          <w:sz w:val="28"/>
+          <w:szCs w:val="28"/>
+        </w:rPr>
+      </w:pPr>
+    </w:p>
+    <w:p>
+      <w:pPr>
+        <w:rPr>
+          <w:b/>
+          <w:bCs/>
+          <w:sz w:val="28"/>
+          <w:szCs w:val="28"/>
+        </w:rPr>
+      </w:pPr>
       <w:r>
         <w:rPr>
           <w:b/>
@@ -1028,10 +1130,10 @@
           <w:szCs w:val="28"/>
         </w:rPr>
         <w:drawing>
-          <wp:inline distT="0" distB="0" distL="0" distR="0" wp14:anchorId="2CC62BCC" wp14:editId="715B33D3">
-            <wp:extent cx="5836257" cy="5454121"/>
-            <wp:effectExtent l="0" t="0" r="0" b="0"/>
-            <wp:docPr id="12" name="Picture 12" descr="A screenshot of a computer program&#10;&#10;Description automatically generated"/>
+          <wp:inline distT="0" distB="0" distL="0" distR="0" wp14:anchorId="13A5944E" wp14:editId="5C8055BD">
+            <wp:extent cx="5939790" cy="5542280"/>
+            <wp:effectExtent l="0" t="0" r="3810" b="1270"/>
+            <wp:docPr id="7" name="Picture 7"/>
             <wp:cNvGraphicFramePr>
               <a:graphicFrameLocks xmlns:a="http://schemas.openxmlformats.org/drawingml/2006/main" noChangeAspect="1"/>
             </wp:cNvGraphicFramePr>
@@ -1039,8 +1141,10 @@
               <a:graphicData uri="http://schemas.openxmlformats.org/drawingml/2006/picture">
                 <pic:pic xmlns:pic="http://schemas.openxmlformats.org/drawingml/2006/picture">
                   <pic:nvPicPr>
-                    <pic:cNvPr id="12" name="Picture 12" descr="A screenshot of a computer program&#10;&#10;Description automatically generated"/>
-                    <pic:cNvPicPr/>
+                    <pic:cNvPr id="0" name="Picture 4"/>
+                    <pic:cNvPicPr>
+                      <a:picLocks noChangeAspect="1" noChangeArrowheads="1"/>
+                    </pic:cNvPicPr>
                   </pic:nvPicPr>
                   <pic:blipFill>
                     <a:blip r:embed="rId9">
@@ -1050,18 +1154,23 @@
                         </a:ext>
                       </a:extLst>
                     </a:blip>
+                    <a:srcRect/>
                     <a:stretch>
                       <a:fillRect/>
                     </a:stretch>
                   </pic:blipFill>
-                  <pic:spPr>
+                  <pic:spPr bwMode="auto">
                     <a:xfrm>
                       <a:off x="0" y="0"/>
-                      <a:ext cx="5842674" cy="5460118"/>
+                      <a:ext cx="5939790" cy="5542280"/>
                     </a:xfrm>
                     <a:prstGeom prst="rect">
                       <a:avLst/>
                     </a:prstGeom>
+                    <a:noFill/>
+                    <a:ln>
+                      <a:noFill/>
+                    </a:ln>
                   </pic:spPr>
                 </pic:pic>
               </a:graphicData>

</xml_diff>